<commit_message>
06: nombra costo laboral por trabajador, placebo en el gráfico del salto de 2023, lectura A sin Q5, diferencia real-placebo con error estándar, contdid reproducible (set.seed) y guardado, títulos corregidos
Co-Authored-By: Claude Sonnet 5 <noreply@anthropic.com>
</commit_message>
<xml_diff>
--- a/4. RESULTADOS/06_tratamiento_continuo/T17_efecto_por_quintil.docx
+++ b/4. RESULTADOS/06_tratamiento_continuo/T17_efecto_por_quintil.docx
@@ -35,7 +35,7 @@
         <w:tblLook w:firstRow="1" w:lastRow="0" w:firstColumn="0" w:lastColumn="0" w:noHBand="0" w:noVBand="1"/>
       </w:tblPr>
       <w:tblGrid>
-        <w:gridCol w:w="2575"/>
+        <w:gridCol w:w="3639"/>
         <w:gridCol w:w="2391"/>
         <w:gridCol w:w="1462"/>
         <w:gridCol w:w="1854"/>
@@ -601,7 +601,7 @@
                 <w:szCs w:val="22"/>
                 <w:color w:val="000000"/>
               </w:rPr>
-              <w:t xml:space="preserve">Salario promedio (log)</w:t>
+              <w:t xml:space="preserve">Costo laboral por trabajador (log)</w:t>
             </w:r>
           </w:p>
         </w:tc>
@@ -1101,7 +1101,7 @@
                 <w:szCs w:val="22"/>
                 <w:color w:val="000000"/>
               </w:rPr>
-              <w:t xml:space="preserve">Salario promedio (log)</w:t>
+              <w:t xml:space="preserve">Costo laboral por trabajador (log)</w:t>
             </w:r>
           </w:p>
         </w:tc>
@@ -1601,7 +1601,7 @@
                 <w:szCs w:val="22"/>
                 <w:color w:val="000000"/>
               </w:rPr>
-              <w:t xml:space="preserve">Salario promedio (log)</w:t>
+              <w:t xml:space="preserve">Costo laboral por trabajador (log)</w:t>
             </w:r>
           </w:p>
         </w:tc>
@@ -2101,7 +2101,7 @@
                 <w:szCs w:val="22"/>
                 <w:color w:val="000000"/>
               </w:rPr>
-              <w:t xml:space="preserve">Salario promedio (log)</w:t>
+              <w:t xml:space="preserve">Costo laboral por trabajador (log)</w:t>
             </w:r>
           </w:p>
         </w:tc>

</xml_diff>